<commit_message>
fix(uat): MCPSelect double-retry, WAV workspace scan, sample.docx security content
- librechat.py: add second MCPSelect retry with page.reload() + 10s settle,
  needed after memory-pressure events that leave the toolbar uninitialised
- librechat.py: expand download_artifact Try 4/5 to cover speech/music/images/
  videos workspace subdirs and add port 8912 (music MCP)
- fixtures/sample.docx: replace placeholder with security policy doc containing
  access control, RBAC, authentication keywords (A-01 assertion was always failing)
- router/workspaces.py: switch data-analyst mlx_model_hint to 4-bit abliterated
  (18GB vs 34GB) — 8-bit was rejected by admission control when Ollama occupied RAM
- router_pipe.py: strip tools/tool_choice from backend body when model doesn't
  support tools (LibreChat injects all MCP schemas globally; Ollama returns 400)

Co-Authored-By: Claude Sonnet 4.6 <noreply@anthropic.com>
</commit_message>
<xml_diff>
--- a/tests/fixtures/sample.docx
+++ b/tests/fixtures/sample.docx
@@ -7,7 +7,7 @@
         <w:pStyle w:val="Title"/>
       </w:pPr>
       <w:r>
-        <w:t>Sample Test Document</w:t>
+        <w:t>Network Security Policy — Access Control Framework</w:t>
       </w:r>
     </w:p>
     <w:p>
@@ -20,7 +20,7 @@
     </w:p>
     <w:p>
       <w:r>
-        <w:t>This is a sample document for UAT testing of the Document Reading capability.</w:t>
+        <w:t>This document outlines the access control and authentication policies for enterprise network infrastructure. It covers identity management, role-based access control (RBAC), and least privilege principles.</w:t>
       </w:r>
     </w:p>
     <w:p>
@@ -28,127 +28,56 @@
         <w:pStyle w:val="Heading1"/>
       </w:pPr>
       <w:r>
-        <w:t>Section 2: Test Data Table</w:t>
+        <w:t>Section 2: Access Control Policy</w:t>
       </w:r>
     </w:p>
-    <w:tbl>
-      <w:tblPr>
-        <w:tblW w:type="auto" w:w="0"/>
-        <w:tblLook w:firstColumn="1" w:firstRow="1" w:lastColumn="0" w:lastRow="0" w:noHBand="0" w:noVBand="1" w:val="04A0"/>
-      </w:tblPr>
-      <w:tblGrid>
-        <w:gridCol w:w="2880"/>
-        <w:gridCol w:w="2880"/>
-        <w:gridCol w:w="2880"/>
-      </w:tblGrid>
-      <w:tr>
-        <w:tc>
-          <w:tcPr>
-            <w:tcW w:type="dxa" w:w="2880"/>
-          </w:tcPr>
-          <w:p>
-            <w:r>
-              <w:t>Name</w:t>
-            </w:r>
-          </w:p>
-        </w:tc>
-        <w:tc>
-          <w:tcPr>
-            <w:tcW w:type="dxa" w:w="2880"/>
-          </w:tcPr>
-          <w:p>
-            <w:r>
-              <w:t>Role</w:t>
-            </w:r>
-          </w:p>
-        </w:tc>
-        <w:tc>
-          <w:tcPr>
-            <w:tcW w:type="dxa" w:w="2880"/>
-          </w:tcPr>
-          <w:p>
-            <w:r>
-              <w:t>Status</w:t>
-            </w:r>
-          </w:p>
-        </w:tc>
-      </w:tr>
-      <w:tr>
-        <w:tc>
-          <w:tcPr>
-            <w:tcW w:type="dxa" w:w="2880"/>
-          </w:tcPr>
-          <w:p>
-            <w:r>
-              <w:t>Alice</w:t>
-            </w:r>
-          </w:p>
-        </w:tc>
-        <w:tc>
-          <w:tcPr>
-            <w:tcW w:type="dxa" w:w="2880"/>
-          </w:tcPr>
-          <w:p>
-            <w:r>
-              <w:t>Engineer</w:t>
-            </w:r>
-          </w:p>
-        </w:tc>
-        <w:tc>
-          <w:tcPr>
-            <w:tcW w:type="dxa" w:w="2880"/>
-          </w:tcPr>
-          <w:p>
-            <w:r>
-              <w:t>Active</w:t>
-            </w:r>
-          </w:p>
-        </w:tc>
-      </w:tr>
-      <w:tr>
-        <w:tc>
-          <w:tcPr>
-            <w:tcW w:type="dxa" w:w="2880"/>
-          </w:tcPr>
-          <w:p>
-            <w:r>
-              <w:t>Bob</w:t>
-            </w:r>
-          </w:p>
-        </w:tc>
-        <w:tc>
-          <w:tcPr>
-            <w:tcW w:type="dxa" w:w="2880"/>
-          </w:tcPr>
-          <w:p>
-            <w:r>
-              <w:t>Analyst</w:t>
-            </w:r>
-          </w:p>
-        </w:tc>
-        <w:tc>
-          <w:tcPr>
-            <w:tcW w:type="dxa" w:w="2880"/>
-          </w:tcPr>
-          <w:p>
-            <w:r>
-              <w:t>Active</w:t>
-            </w:r>
-          </w:p>
-        </w:tc>
-      </w:tr>
-    </w:tbl>
+    <w:p>
+      <w:r>
+        <w:t>Access control must follow the principle of least privilege: users and systems are granted only the permissions required to perform their specific function. All access requests must be justified and approved by the relevant resource owner.</w:t>
+      </w:r>
+    </w:p>
+    <w:p>
+      <w:r>
+        <w:t>Role-based access control (RBAC) is the primary authorization model. Roles are defined at the department level and reviewed quarterly. No user account may hold roles exceeding their job function.</w:t>
+      </w:r>
+    </w:p>
     <w:p>
       <w:pPr>
         <w:pStyle w:val="Heading1"/>
       </w:pPr>
       <w:r>
-        <w:t>Section 3: Conclusion</w:t>
+        <w:t>Section 3: Authentication Requirements</w:t>
       </w:r>
     </w:p>
     <w:p>
       <w:r>
-        <w:t>End of sample document.</w:t>
+        <w:t>All user authentication must use multi-factor authentication (MFA). Service accounts require certificate-based authentication. Passwords must be at least 16 characters. Session tokens expire after 8 hours of inactivity.</w:t>
+      </w:r>
+    </w:p>
+    <w:p>
+      <w:pPr>
+        <w:pStyle w:val="Heading1"/>
+      </w:pPr>
+      <w:r>
+        <w:t>Section 4: Authorization and Audit</w:t>
+      </w:r>
+    </w:p>
+    <w:p>
+      <w:r>
+        <w:t>Authorization decisions are logged centrally. Privileged access management (PAM) controls all administrative sessions. Access to sensitive systems requires just-in-time (JIT) authorization with a 4-hour window.</w:t>
+      </w:r>
+    </w:p>
+    <w:p>
+      <w:pPr>
+        <w:pStyle w:val="Heading1"/>
+      </w:pPr>
+      <w:r>
+        <w:t>Section 5: Conclusion</w:t>
+      </w:r>
+    </w:p>
+    <w:p>
+      <w:r>
+        <w:t>Adherence to this access control framework is mandatory for all staff and contractors. Violations are subject to disciplinary action including revocation of system access.</w:t>
       </w:r>
     </w:p>
     <w:sectPr>

</xml_diff>